<commit_message>
Refactor generische Bewertungsengine implementiert
- alte hartcodierte Bewertungslogik entfernt
- generischen Vergleich von Musterlösung und Studentenlösung umgesetzt
- automatische Erkennung von Aufgaben anhand der Musterlösung
- Bewertung auf Aufgabenebene statt Zellebene eingeführt
- Vergleich aller Arbeitsblätter, Zeilen und Zellen implementiert
- automatische Punkteberechnung über die Bewertungsengine
- PruefungsService deutlich vereinfacht
</commit_message>
<xml_diff>
--- a/präsentation stichpunkte.docx
+++ b/präsentation stichpunkte.docx
@@ -10,6 +10,12 @@
     <w:p>
       <w:r>
         <w:t>"Zu Beginn war die Bewertungslogik vollständig hartcodiert und nur für eine einzige Prüfung geeignet. Im weiteren Verlauf wurde sie schrittweise zu einem generischen Vergleichssystem weiterentwickelt. Das System lädt die zur Prüfung gehörende Musterlösung aus der Datenbank und vergleicht anschließend die vom Studenten abgegebene Datei automatisch mit dieser Musterlösung."</w:t>
+      </w:r>
+    </w:p>
+    <w:p/>
+    <w:p>
+      <w:r>
+        <w:t>"Das System automatisiert alle eindeutig bewertbaren Aufgaben und unterstützt den Dozenten bei allen Aufgaben mit mehreren möglichen Lösungswegen. Dadurch wird der Korrekturaufwand erheblich reduziert, ohne dass fachlich korrekte Alternativlösungen verloren gehen."</w:t>
       </w:r>
     </w:p>
     <w:sectPr>

</xml_diff>